<commit_message>
feat: resolve dask dependency and prepare for cloud deployment
</commit_message>
<xml_diff>
--- a/templates/flood_template.docx
+++ b/templates/flood_template.docx
@@ -33,157 +33,37 @@
     <w:p/>
     <w:p>
       <w:r>
-        <w:t xml:space="preserve">• AOI Name: </w:t>
-      </w:r>
-      <w:proofErr w:type="gramStart"/>
-      <w:r>
-        <w:t xml:space="preserve">{{ </w:t>
-      </w:r>
-      <w:proofErr w:type="spellStart"/>
-      <w:r>
-        <w:t>region</w:t>
-      </w:r>
-      <w:proofErr w:type="gramEnd"/>
-      <w:r>
-        <w:t>_name</w:t>
-      </w:r>
-      <w:proofErr w:type="spellEnd"/>
-      <w:r>
-        <w:t xml:space="preserve"> }}</w:t>
-      </w:r>
-    </w:p>
-    <w:p>
-      <w:r>
-        <w:t xml:space="preserve">• Center Coordinates: </w:t>
-      </w:r>
-      <w:proofErr w:type="gramStart"/>
-      <w:r>
-        <w:t xml:space="preserve">{{ </w:t>
-      </w:r>
-      <w:proofErr w:type="spellStart"/>
-      <w:r>
-        <w:t>center</w:t>
-      </w:r>
-      <w:proofErr w:type="gramEnd"/>
-      <w:r>
-        <w:t>_lat</w:t>
-      </w:r>
-      <w:proofErr w:type="spellEnd"/>
-      <w:r>
-        <w:t xml:space="preserve"> }}, {{ </w:t>
-      </w:r>
-      <w:proofErr w:type="spellStart"/>
-      <w:r>
-        <w:t>center_lon</w:t>
-      </w:r>
-      <w:proofErr w:type="spellEnd"/>
-      <w:r>
-        <w:t xml:space="preserve"> }}</w:t>
-      </w:r>
-    </w:p>
-    <w:p>
-      <w:r>
-        <w:t xml:space="preserve">• Area: </w:t>
-      </w:r>
-      <w:proofErr w:type="gramStart"/>
-      <w:r>
-        <w:t xml:space="preserve">{{ </w:t>
-      </w:r>
-      <w:proofErr w:type="spellStart"/>
-      <w:r>
-        <w:t>area</w:t>
-      </w:r>
-      <w:proofErr w:type="gramEnd"/>
-      <w:r>
-        <w:t>_sqkm</w:t>
-      </w:r>
-      <w:proofErr w:type="spellEnd"/>
-      <w:r>
-        <w:t xml:space="preserve"> }} sq km</w:t>
-      </w:r>
-    </w:p>
-    <w:p>
-      <w:r>
-        <w:t xml:space="preserve">• Baseline Date: </w:t>
-      </w:r>
-      <w:proofErr w:type="gramStart"/>
-      <w:r>
-        <w:t xml:space="preserve">{{ </w:t>
-      </w:r>
-      <w:proofErr w:type="spellStart"/>
-      <w:r>
-        <w:t>baseline</w:t>
-      </w:r>
-      <w:proofErr w:type="gramEnd"/>
-      <w:r>
-        <w:t>_date</w:t>
-      </w:r>
-      <w:proofErr w:type="spellEnd"/>
-      <w:r>
-        <w:t xml:space="preserve"> }}</w:t>
-      </w:r>
-    </w:p>
-    <w:p>
-      <w:r>
-        <w:t xml:space="preserve">• Mean Elevation: </w:t>
-      </w:r>
-      <w:proofErr w:type="gramStart"/>
-      <w:r>
-        <w:t xml:space="preserve">{{ </w:t>
-      </w:r>
-      <w:proofErr w:type="spellStart"/>
-      <w:r>
-        <w:t>mean</w:t>
-      </w:r>
-      <w:proofErr w:type="gramEnd"/>
-      <w:r>
-        <w:t>_elevation</w:t>
-      </w:r>
-      <w:proofErr w:type="spellEnd"/>
-      <w:r>
-        <w:t xml:space="preserve"> }} m</w:t>
-      </w:r>
-    </w:p>
-    <w:p>
-      <w:r>
-        <w:t xml:space="preserve">• Confidence Score: </w:t>
-      </w:r>
-      <w:proofErr w:type="gramStart"/>
-      <w:r>
-        <w:t xml:space="preserve">{{ </w:t>
-      </w:r>
-      <w:proofErr w:type="spellStart"/>
-      <w:r>
-        <w:t>confidence</w:t>
-      </w:r>
-      <w:proofErr w:type="gramEnd"/>
-      <w:r>
-        <w:t>_score</w:t>
-      </w:r>
-      <w:proofErr w:type="spellEnd"/>
-      <w:r>
-        <w:t xml:space="preserve"> }}%</w:t>
-      </w:r>
-    </w:p>
-    <w:p>
-      <w:r>
-        <w:t xml:space="preserve">• Maximum Flood Footprint: </w:t>
-      </w:r>
-      <w:proofErr w:type="gramStart"/>
-      <w:r>
-        <w:t xml:space="preserve">{{ </w:t>
-      </w:r>
-      <w:proofErr w:type="spellStart"/>
-      <w:r>
-        <w:t>max</w:t>
-      </w:r>
-      <w:proofErr w:type="gramEnd"/>
-      <w:r>
-        <w:t>_flood_sqkm</w:t>
-      </w:r>
-      <w:proofErr w:type="spellEnd"/>
-      <w:r>
-        <w:t xml:space="preserve"> }} sq km</w:t>
+        <w:t>• AOI Name: {{ region_name }}</w:t>
+      </w:r>
+    </w:p>
+    <w:p>
+      <w:r>
+        <w:t>• Center Coordinates: {{ center_lat }}, {{ center_lon }}</w:t>
+      </w:r>
+    </w:p>
+    <w:p>
+      <w:r>
+        <w:t>• Area: {{ area_sqkm }} sq km</w:t>
+      </w:r>
+    </w:p>
+    <w:p>
+      <w:r>
+        <w:t>• Baseline Date: {{ baseline_date }}</w:t>
+      </w:r>
+    </w:p>
+    <w:p>
+      <w:r>
+        <w:t>• Mean Elevation: {{ mean_elevation }} m</w:t>
+      </w:r>
+    </w:p>
+    <w:p>
+      <w:r>
+        <w:t>• Confidence Score: {{ confidence_score }}%</w:t>
+      </w:r>
+    </w:p>
+    <w:p>
+      <w:r>
+        <w:t>• Maximum Flood Footprint: {{ max_flood_sqkm }} sq km</w:t>
       </w:r>
     </w:p>
     <w:p>
@@ -203,121 +83,33 @@
     <w:p/>
     <w:p>
       <w:r>
-        <w:t xml:space="preserve">{% for t in </w:t>
-      </w:r>
-      <w:proofErr w:type="spellStart"/>
-      <w:r>
-        <w:t>tier_table</w:t>
-      </w:r>
-      <w:proofErr w:type="spellEnd"/>
-      <w:r>
-        <w:t xml:space="preserve"> %}</w:t>
-      </w:r>
-    </w:p>
-    <w:p>
-      <w:r>
-        <w:t xml:space="preserve">Tier </w:t>
-      </w:r>
-      <w:proofErr w:type="gramStart"/>
-      <w:r>
-        <w:t xml:space="preserve">{{ </w:t>
-      </w:r>
-      <w:proofErr w:type="spellStart"/>
-      <w:r>
-        <w:t>t</w:t>
-      </w:r>
-      <w:proofErr w:type="gramEnd"/>
-      <w:r>
-        <w:t>.tier</w:t>
-      </w:r>
-      <w:proofErr w:type="spellEnd"/>
-      <w:r>
-        <w:t xml:space="preserve"> }}</w:t>
-      </w:r>
-    </w:p>
-    <w:p/>
-    <w:p>
-      <w:r>
-        <w:t xml:space="preserve">- Event Date: </w:t>
-      </w:r>
-      <w:proofErr w:type="gramStart"/>
-      <w:r>
-        <w:t xml:space="preserve">{{ </w:t>
-      </w:r>
-      <w:proofErr w:type="spellStart"/>
-      <w:r>
-        <w:t>t</w:t>
-      </w:r>
-      <w:proofErr w:type="gramEnd"/>
-      <w:r>
-        <w:t>.date</w:t>
-      </w:r>
-      <w:proofErr w:type="spellEnd"/>
-      <w:r>
-        <w:t xml:space="preserve"> }}</w:t>
-      </w:r>
-    </w:p>
-    <w:p>
-      <w:r>
-        <w:t xml:space="preserve">- Rainfall Intensity: </w:t>
-      </w:r>
-      <w:proofErr w:type="gramStart"/>
-      <w:r>
-        <w:t xml:space="preserve">{{ </w:t>
-      </w:r>
-      <w:proofErr w:type="spellStart"/>
-      <w:r>
-        <w:t>t</w:t>
-      </w:r>
-      <w:proofErr w:type="gramEnd"/>
-      <w:r>
-        <w:t>.rainfall</w:t>
-      </w:r>
-      <w:proofErr w:type="spellEnd"/>
-      <w:r>
-        <w:t xml:space="preserve"> }} mm</w:t>
-      </w:r>
-    </w:p>
-    <w:p>
-      <w:r>
-        <w:t xml:space="preserve">- Severity Class: </w:t>
-      </w:r>
-      <w:proofErr w:type="gramStart"/>
-      <w:r>
-        <w:t xml:space="preserve">{{ </w:t>
-      </w:r>
-      <w:proofErr w:type="spellStart"/>
-      <w:r>
-        <w:t>t</w:t>
-      </w:r>
-      <w:proofErr w:type="gramEnd"/>
-      <w:r>
-        <w:t>.label</w:t>
-      </w:r>
-      <w:proofErr w:type="spellEnd"/>
-      <w:r>
-        <w:t xml:space="preserve"> }}</w:t>
-      </w:r>
-    </w:p>
-    <w:p>
-      <w:r>
-        <w:t xml:space="preserve">- Flooded Area: </w:t>
-      </w:r>
-      <w:proofErr w:type="gramStart"/>
-      <w:r>
-        <w:t xml:space="preserve">{{ </w:t>
-      </w:r>
-      <w:proofErr w:type="spellStart"/>
-      <w:r>
-        <w:t>t</w:t>
-      </w:r>
-      <w:proofErr w:type="gramEnd"/>
-      <w:r>
-        <w:t>.area</w:t>
-      </w:r>
-      <w:proofErr w:type="spellEnd"/>
-      <w:r>
-        <w:t xml:space="preserve"> }} sq km</w:t>
+        <w:t>{% for t in tier_table %}</w:t>
+      </w:r>
+    </w:p>
+    <w:p>
+      <w:r>
+        <w:t>Tier {{ t.tier }}</w:t>
+      </w:r>
+    </w:p>
+    <w:p/>
+    <w:p>
+      <w:r>
+        <w:t>- Event Date: {{ t.date }}</w:t>
+      </w:r>
+    </w:p>
+    <w:p>
+      <w:r>
+        <w:t>- Rainfall Intensity: {{ t.rainfall }} mm</w:t>
+      </w:r>
+    </w:p>
+    <w:p>
+      <w:r>
+        <w:t>- Severity Class: {{ t.label }}</w:t>
+      </w:r>
+    </w:p>
+    <w:p>
+      <w:r>
+        <w:t>- Flooded Area: {{ t.area }} sq km</w:t>
       </w:r>
     </w:p>
     <w:p>
@@ -330,15 +122,7 @@
     <w:p>
       <w:r>
         <w:lastRenderedPageBreak/>
-        <w:t xml:space="preserve">{% </w:t>
-      </w:r>
-      <w:proofErr w:type="spellStart"/>
-      <w:r>
-        <w:t>endfor</w:t>
-      </w:r>
-      <w:proofErr w:type="spellEnd"/>
-      <w:r>
-        <w:t xml:space="preserve"> %}</w:t>
+        <w:t>{% endfor %}</w:t>
       </w:r>
     </w:p>
     <w:p/>
@@ -381,75 +165,76 @@
       </w:r>
     </w:p>
     <w:p>
-      <w:proofErr w:type="gramStart"/>
-      <w:r>
-        <w:t xml:space="preserve">{{ </w:t>
-      </w:r>
-      <w:proofErr w:type="spellStart"/>
-      <w:r>
-        <w:t>heatmap</w:t>
-      </w:r>
-      <w:proofErr w:type="gramEnd"/>
-      <w:r>
-        <w:t>_image</w:t>
-      </w:r>
-      <w:proofErr w:type="spellEnd"/>
-      <w:r>
-        <w:t xml:space="preserve"> }}</w:t>
-      </w:r>
-    </w:p>
-    <w:p>
-      <w:proofErr w:type="gramStart"/>
-      <w:r>
-        <w:t xml:space="preserve">{{ </w:t>
-      </w:r>
-      <w:proofErr w:type="spellStart"/>
-      <w:r>
-        <w:t>dem</w:t>
-      </w:r>
-      <w:proofErr w:type="gramEnd"/>
-      <w:r>
-        <w:t>_map</w:t>
-      </w:r>
-      <w:proofErr w:type="spellEnd"/>
-      <w:r>
-        <w:t xml:space="preserve"> }}</w:t>
-      </w:r>
-    </w:p>
-    <w:p>
-      <w:proofErr w:type="gramStart"/>
-      <w:r>
-        <w:t xml:space="preserve">{{ </w:t>
-      </w:r>
-      <w:proofErr w:type="spellStart"/>
-      <w:r>
-        <w:t>wc</w:t>
-      </w:r>
-      <w:proofErr w:type="gramEnd"/>
-      <w:r>
-        <w:t>_map</w:t>
-      </w:r>
-      <w:proofErr w:type="spellEnd"/>
-      <w:r>
-        <w:t xml:space="preserve"> }}</w:t>
-      </w:r>
-    </w:p>
-    <w:p>
-      <w:proofErr w:type="gramStart"/>
-      <w:r>
-        <w:t xml:space="preserve">{{ </w:t>
-      </w:r>
-      <w:proofErr w:type="spellStart"/>
-      <w:r>
-        <w:t>jrc</w:t>
-      </w:r>
-      <w:proofErr w:type="gramEnd"/>
-      <w:r>
-        <w:t>_map</w:t>
-      </w:r>
-      <w:proofErr w:type="spellEnd"/>
-      <w:r>
-        <w:t xml:space="preserve"> }}</w:t>
+      <w:r>
+        <w:t>{{ heatmap_image }}</w:t>
+      </w:r>
+    </w:p>
+    <w:p>
+      <w:pPr>
+        <w:rPr>
+          <w:b/>
+          <w:bCs/>
+        </w:rPr>
+      </w:pPr>
+      <w:r>
+        <w:rPr>
+          <w:b/>
+          <w:bCs/>
+        </w:rPr>
+        <w:t>DEM of The Area</w:t>
+      </w:r>
+    </w:p>
+    <w:p>
+      <w:r>
+        <w:t>{{ dem_map }}</w:t>
+      </w:r>
+    </w:p>
+    <w:p>
+      <w:pPr>
+        <w:rPr>
+          <w:b/>
+          <w:bCs/>
+        </w:rPr>
+      </w:pPr>
+      <w:r>
+        <w:rPr>
+          <w:b/>
+          <w:bCs/>
+        </w:rPr>
+        <w:t>World Cover Type Map</w:t>
+      </w:r>
+    </w:p>
+    <w:p>
+      <w:pPr>
+        <w:rPr>
+          <w:b/>
+          <w:bCs/>
+        </w:rPr>
+      </w:pPr>
+      <w:r>
+        <w:t>{{ wc_map }}</w:t>
+      </w:r>
+      <w:r>
+        <w:br/>
+      </w:r>
+      <w:r>
+        <w:rPr>
+          <w:b/>
+          <w:bCs/>
+        </w:rPr>
+        <w:t>JRC Permanent Water</w:t>
+      </w:r>
+      <w:r>
+        <w:rPr>
+          <w:b/>
+          <w:bCs/>
+        </w:rPr>
+        <w:t>body Map</w:t>
+      </w:r>
+    </w:p>
+    <w:p>
+      <w:r>
+        <w:t>{{ jrc_map }}</w:t>
       </w:r>
     </w:p>
     <w:p/>
@@ -466,21 +251,8 @@
     </w:p>
     <w:p/>
     <w:p>
-      <w:proofErr w:type="gramStart"/>
-      <w:r>
-        <w:t xml:space="preserve">{{ </w:t>
-      </w:r>
-      <w:proofErr w:type="spellStart"/>
-      <w:r>
-        <w:t>rainfall</w:t>
-      </w:r>
-      <w:proofErr w:type="gramEnd"/>
-      <w:r>
-        <w:t>_chart</w:t>
-      </w:r>
-      <w:proofErr w:type="spellEnd"/>
-      <w:r>
-        <w:t xml:space="preserve"> }}</w:t>
+      <w:r>
+        <w:t>{{ rainfall_chart }}</w:t>
       </w:r>
     </w:p>
     <w:p>
@@ -495,21 +267,8 @@
       </w:r>
     </w:p>
     <w:p>
-      <w:proofErr w:type="gramStart"/>
-      <w:r>
-        <w:t xml:space="preserve">{{ </w:t>
-      </w:r>
-      <w:proofErr w:type="spellStart"/>
-      <w:r>
-        <w:t>tier</w:t>
-      </w:r>
-      <w:proofErr w:type="gramEnd"/>
-      <w:r>
-        <w:t>_chart</w:t>
-      </w:r>
-      <w:proofErr w:type="spellEnd"/>
-      <w:r>
-        <w:t xml:space="preserve"> }}</w:t>
+      <w:r>
+        <w:t>{{ tier_chart }}</w:t>
       </w:r>
     </w:p>
     <w:p>
@@ -528,21 +287,9 @@
     </w:p>
     <w:p/>
     <w:p>
-      <w:proofErr w:type="gramStart"/>
-      <w:r>
-        <w:t xml:space="preserve">{{ </w:t>
-      </w:r>
-      <w:proofErr w:type="spellStart"/>
-      <w:r>
-        <w:t>landcover</w:t>
-      </w:r>
-      <w:proofErr w:type="gramEnd"/>
-      <w:r>
-        <w:t>_chart</w:t>
-      </w:r>
-      <w:proofErr w:type="spellEnd"/>
-      <w:r>
-        <w:t xml:space="preserve"> }}</w:t>
+      <w:r>
+        <w:lastRenderedPageBreak/>
+        <w:t>{{ landcover_chart }}</w:t>
       </w:r>
     </w:p>
     <w:p>
@@ -553,66 +300,17 @@
     <w:p/>
     <w:p>
       <w:r>
-        <w:lastRenderedPageBreak/>
-        <w:t xml:space="preserve">• Cropland Exposure: </w:t>
-      </w:r>
-      <w:proofErr w:type="gramStart"/>
-      <w:r>
-        <w:t xml:space="preserve">{{ </w:t>
-      </w:r>
-      <w:proofErr w:type="spellStart"/>
-      <w:r>
-        <w:t>cropland</w:t>
-      </w:r>
-      <w:proofErr w:type="gramEnd"/>
-      <w:r>
-        <w:t>_total</w:t>
-      </w:r>
-      <w:proofErr w:type="spellEnd"/>
-      <w:r>
-        <w:t xml:space="preserve"> }} sq km</w:t>
-      </w:r>
-    </w:p>
-    <w:p>
-      <w:r>
-        <w:t xml:space="preserve">• Urban Exposure: </w:t>
-      </w:r>
-      <w:proofErr w:type="gramStart"/>
-      <w:r>
-        <w:t xml:space="preserve">{{ </w:t>
-      </w:r>
-      <w:proofErr w:type="spellStart"/>
-      <w:r>
-        <w:t>urban</w:t>
-      </w:r>
-      <w:proofErr w:type="gramEnd"/>
-      <w:r>
-        <w:t>_total</w:t>
-      </w:r>
-      <w:proofErr w:type="spellEnd"/>
-      <w:r>
-        <w:t xml:space="preserve"> }} sq km</w:t>
-      </w:r>
-    </w:p>
-    <w:p>
-      <w:r>
-        <w:t xml:space="preserve">• Forest Exposure: </w:t>
-      </w:r>
-      <w:proofErr w:type="gramStart"/>
-      <w:r>
-        <w:t xml:space="preserve">{{ </w:t>
-      </w:r>
-      <w:proofErr w:type="spellStart"/>
-      <w:r>
-        <w:t>forest</w:t>
-      </w:r>
-      <w:proofErr w:type="gramEnd"/>
-      <w:r>
-        <w:t>_total</w:t>
-      </w:r>
-      <w:proofErr w:type="spellEnd"/>
-      <w:r>
-        <w:t xml:space="preserve"> }} sq km</w:t>
+        <w:t>• Cropland Exposure: {{ cropland_total }} sq km</w:t>
+      </w:r>
+    </w:p>
+    <w:p>
+      <w:r>
+        <w:t>• Urban Exposure: {{ urban_total }} sq km</w:t>
+      </w:r>
+    </w:p>
+    <w:p>
+      <w:r>
+        <w:t>• Forest Exposure: {{ forest_total }} sq km</w:t>
       </w:r>
     </w:p>
     <w:p>
@@ -633,21 +331,8 @@
       </w:r>
     </w:p>
     <w:p>
-      <w:proofErr w:type="gramStart"/>
-      <w:r>
-        <w:t xml:space="preserve">{{ </w:t>
-      </w:r>
-      <w:proofErr w:type="spellStart"/>
-      <w:r>
-        <w:t>critical</w:t>
-      </w:r>
-      <w:proofErr w:type="gramEnd"/>
-      <w:r>
-        <w:t>_thresholds</w:t>
-      </w:r>
-      <w:proofErr w:type="spellEnd"/>
-      <w:r>
-        <w:t xml:space="preserve"> }}</w:t>
+      <w:r>
+        <w:t>{{ critical_thresholds }}</w:t>
       </w:r>
     </w:p>
     <w:p>
@@ -663,21 +348,8 @@
     </w:p>
     <w:p/>
     <w:p>
-      <w:proofErr w:type="gramStart"/>
-      <w:r>
-        <w:t xml:space="preserve">{{ </w:t>
-      </w:r>
-      <w:proofErr w:type="spellStart"/>
-      <w:r>
-        <w:t>high</w:t>
-      </w:r>
-      <w:proofErr w:type="gramEnd"/>
-      <w:r>
-        <w:t>_risk_zones</w:t>
-      </w:r>
-      <w:proofErr w:type="spellEnd"/>
-      <w:r>
-        <w:t xml:space="preserve"> }}</w:t>
+      <w:r>
+        <w:t>{{ high_risk_zones }}</w:t>
       </w:r>
     </w:p>
     <w:p>

</xml_diff>